<commit_message>
Se agrego comentarios tecnicos
</commit_message>
<xml_diff>
--- a/docs/Documentacion teams.docx
+++ b/docs/Documentacion teams.docx
@@ -1,6 +1,6 @@
 
 <file path=word/document.xml><?xml version="1.0" encoding="utf-8"?>
-<w:document xmlns:wpc="http://schemas.microsoft.com/office/word/2010/wordprocessingCanvas" xmlns:cx="http://schemas.microsoft.com/office/drawing/2014/chartex" xmlns:cx1="http://schemas.microsoft.com/office/drawing/2015/9/8/chartex" xmlns:cx2="http://schemas.microsoft.com/office/drawing/2015/10/21/chartex" xmlns:cx3="http://schemas.microsoft.com/office/drawing/2016/5/9/chartex" xmlns:cx4="http://schemas.microsoft.com/office/drawing/2016/5/10/chartex" xmlns:cx5="http://schemas.microsoft.com/office/drawing/2016/5/11/chartex" xmlns:cx6="http://schemas.microsoft.com/office/drawing/2016/5/12/chartex" xmlns:cx7="http://schemas.microsoft.com/office/drawing/2016/5/13/chartex" xmlns:cx8="http://schemas.microsoft.com/office/drawing/2016/5/14/chartex" xmlns:mc="http://schemas.openxmlformats.org/markup-compatibility/2006" xmlns:aink="http://schemas.microsoft.com/office/drawing/2016/ink" xmlns:am3d="http://schemas.microsoft.com/office/drawing/2017/model3d" xmlns:o="urn:schemas-microsoft-com:office:office" xmlns:oel="http://schemas.microsoft.com/office/2019/extlst" xmlns:r="http://schemas.openxmlformats.org/officeDocument/2006/relationships" xmlns:m="http://schemas.openxmlformats.org/officeDocument/2006/math" xmlns:v="urn:schemas-microsoft-com:vml" xmlns:wp14="http://schemas.microsoft.com/office/word/2010/wordprocessingDrawing" xmlns:wp="http://schemas.openxmlformats.org/drawingml/2006/wordprocessingDrawing" xmlns:w10="urn:schemas-microsoft-com:office:word" xmlns:w="http://schemas.openxmlformats.org/wordprocessingml/2006/main" xmlns:w14="http://schemas.microsoft.com/office/word/2010/wordml" xmlns:w15="http://schemas.microsoft.com/office/word/2012/wordml" xmlns:w16cex="http://schemas.microsoft.com/office/word/2018/wordml/cex" xmlns:w16cid="http://schemas.microsoft.com/office/word/2016/wordml/cid" xmlns:w16="http://schemas.microsoft.com/office/word/2018/wordml" xmlns:w16du="http://schemas.microsoft.com/office/word/2023/wordml/word16du" xmlns:w16sdtdh="http://schemas.microsoft.com/office/word/2020/wordml/sdtdatahash" xmlns:w16sdtfl="http://schemas.microsoft.com/office/word/2024/wordml/sdtformatlock" xmlns:w16se="http://schemas.microsoft.com/office/word/2015/wordml/symex" xmlns:wpg="http://schemas.microsoft.com/office/word/2010/wordprocessingGroup" xmlns:wpi="http://schemas.microsoft.com/office/word/2010/wordprocessingInk" xmlns:wne="http://schemas.microsoft.com/office/word/2006/wordml" xmlns:wps="http://schemas.microsoft.com/office/word/2010/wordprocessingShape" mc:Ignorable="w14 w15 w16se w16cid w16 w16cex w16sdtdh w16sdtfl w16du wp14">
+<w:document xmlns:wpc="http://schemas.microsoft.com/office/word/2010/wordprocessingCanvas" xmlns:cx="http://schemas.microsoft.com/office/drawing/2014/chartex" xmlns:cx1="http://schemas.microsoft.com/office/drawing/2015/9/8/chartex" xmlns:cx2="http://schemas.microsoft.com/office/drawing/2015/10/21/chartex" xmlns:cx3="http://schemas.microsoft.com/office/drawing/2016/5/9/chartex" xmlns:cx4="http://schemas.microsoft.com/office/drawing/2016/5/10/chartex" xmlns:cx5="http://schemas.microsoft.com/office/drawing/2016/5/11/chartex" xmlns:cx6="http://schemas.microsoft.com/office/drawing/2016/5/12/chartex" xmlns:cx7="http://schemas.microsoft.com/office/drawing/2016/5/13/chartex" xmlns:cx8="http://schemas.microsoft.com/office/drawing/2016/5/14/chartex" xmlns:mc="http://schemas.openxmlformats.org/markup-compatibility/2006" xmlns:aink="http://schemas.microsoft.com/office/drawing/2016/ink" xmlns:am3d="http://schemas.microsoft.com/office/drawing/2017/model3d" xmlns:o="urn:schemas-microsoft-com:office:office" xmlns:oel="http://schemas.microsoft.com/office/2019/extlst" xmlns:r="http://schemas.openxmlformats.org/officeDocument/2006/relationships" xmlns:m="http://schemas.openxmlformats.org/officeDocument/2006/math" xmlns:v="urn:schemas-microsoft-com:vml" xmlns:wp14="http://schemas.microsoft.com/office/word/2010/wordprocessingDrawing" xmlns:wp="http://schemas.openxmlformats.org/drawingml/2006/wordprocessingDrawing" xmlns:w10="urn:schemas-microsoft-com:office:word" xmlns:w="http://schemas.openxmlformats.org/wordprocessingml/2006/main" xmlns:w14="http://schemas.microsoft.com/office/word/2010/wordml" xmlns:w15="http://schemas.microsoft.com/office/word/2012/wordml" xmlns:w16cex="http://schemas.microsoft.com/office/word/2018/wordml/cex" xmlns:w16cid="http://schemas.microsoft.com/office/word/2016/wordml/cid" xmlns:w16="http://schemas.microsoft.com/office/word/2018/wordml" xmlns:w16du="http://schemas.microsoft.com/office/word/2023/wordml/word16du" xmlns:w16sdtdh="http://schemas.microsoft.com/office/word/2020/wordml/sdtdatahash" xmlns:w16se="http://schemas.microsoft.com/office/word/2015/wordml/symex" xmlns:wpg="http://schemas.microsoft.com/office/word/2010/wordprocessingGroup" xmlns:wpi="http://schemas.microsoft.com/office/word/2010/wordprocessingInk" xmlns:wne="http://schemas.microsoft.com/office/word/2006/wordml" xmlns:wps="http://schemas.microsoft.com/office/word/2010/wordprocessingShape" mc:Ignorable="w14 w15 w16se w16cid w16 w16cex w16sdtdh w16du wp14">
   <w:body>
     <w:p>
       <w:pPr>
@@ -18,6 +18,7 @@
           <w14:ligatures w14:val="none"/>
         </w:rPr>
       </w:pPr>
+      <w:proofErr w:type="gramStart"/>
       <w:r>
         <w:rPr>
           <w:rFonts w:ascii="Times New Roman" w:eastAsia="Times New Roman" w:hAnsi="Times New Roman" w:cs="Times New Roman"/>
@@ -30,7 +31,22 @@
           <w:lang w:eastAsia="es-MX"/>
           <w14:ligatures w14:val="none"/>
         </w:rPr>
-        <w:t>DOCUMENTO 2 — GUÍA DEL EQUIPO</w:t>
+        <w:t>DOCUMENTO  —</w:t>
+      </w:r>
+      <w:proofErr w:type="gramEnd"/>
+      <w:r>
+        <w:rPr>
+          <w:rFonts w:ascii="Times New Roman" w:eastAsia="Times New Roman" w:hAnsi="Times New Roman" w:cs="Times New Roman"/>
+          <w:b/>
+          <w:bCs/>
+          <w:color w:val="000000" w:themeColor="text1"/>
+          <w:kern w:val="36"/>
+          <w:sz w:val="48"/>
+          <w:szCs w:val="48"/>
+          <w:lang w:eastAsia="es-MX"/>
+          <w14:ligatures w14:val="none"/>
+        </w:rPr>
+        <w:t xml:space="preserve"> GUÍA DEL EQUIPO</w:t>
       </w:r>
     </w:p>
     <w:p>
@@ -110,8 +126,22 @@
           <w:lang w:eastAsia="es-MX"/>
           <w14:ligatures w14:val="none"/>
         </w:rPr>
-        <w:t>Taller III — Fundación Kinal</w:t>
-      </w:r>
+        <w:t xml:space="preserve">Taller III — Fundación </w:t>
+      </w:r>
+      <w:proofErr w:type="spellStart"/>
+      <w:r>
+        <w:rPr>
+          <w:rFonts w:ascii="Times New Roman" w:eastAsia="Times New Roman" w:hAnsi="Times New Roman" w:cs="Times New Roman"/>
+          <w:b/>
+          <w:bCs/>
+          <w:color w:val="000000" w:themeColor="text1"/>
+          <w:kern w:val="0"/>
+          <w:lang w:eastAsia="es-MX"/>
+          <w14:ligatures w14:val="none"/>
+        </w:rPr>
+        <w:t>Kinal</w:t>
+      </w:r>
+      <w:proofErr w:type="spellEnd"/>
       <w:r>
         <w:rPr>
           <w:rFonts w:ascii="Times New Roman" w:eastAsia="Times New Roman" w:hAnsi="Times New Roman" w:cs="Times New Roman"/>
@@ -122,17 +152,31 @@
         </w:rPr>
         <w:t> </w:t>
       </w:r>
-      <w:r>
-        <w:rPr>
-          <w:rFonts w:ascii="Times New Roman" w:eastAsia="Times New Roman" w:hAnsi="Times New Roman" w:cs="Times New Roman"/>
-          <w:b/>
-          <w:bCs/>
-          <w:color w:val="000000" w:themeColor="text1"/>
-          <w:kern w:val="0"/>
-          <w:lang w:eastAsia="es-MX"/>
-          <w14:ligatures w14:val="none"/>
-        </w:rPr>
-        <w:t>Marzo 2026</w:t>
+      <w:proofErr w:type="gramStart"/>
+      <w:r>
+        <w:rPr>
+          <w:rFonts w:ascii="Times New Roman" w:eastAsia="Times New Roman" w:hAnsi="Times New Roman" w:cs="Times New Roman"/>
+          <w:b/>
+          <w:bCs/>
+          <w:color w:val="000000" w:themeColor="text1"/>
+          <w:kern w:val="0"/>
+          <w:lang w:eastAsia="es-MX"/>
+          <w14:ligatures w14:val="none"/>
+        </w:rPr>
+        <w:t>Marzo</w:t>
+      </w:r>
+      <w:proofErr w:type="gramEnd"/>
+      <w:r>
+        <w:rPr>
+          <w:rFonts w:ascii="Times New Roman" w:eastAsia="Times New Roman" w:hAnsi="Times New Roman" w:cs="Times New Roman"/>
+          <w:b/>
+          <w:bCs/>
+          <w:color w:val="000000" w:themeColor="text1"/>
+          <w:kern w:val="0"/>
+          <w:lang w:eastAsia="es-MX"/>
+          <w14:ligatures w14:val="none"/>
+        </w:rPr>
+        <w:t xml:space="preserve"> 2026</w:t>
       </w:r>
     </w:p>
     <w:p>
@@ -241,7 +285,27 @@
           <w:lang w:eastAsia="es-MX"/>
           <w14:ligatures w14:val="none"/>
         </w:rPr>
-        <w:t>Cuando alguien inicia sesión, el servidor de C# le da un token. Ese token es como un pase de acceso que el usuario manda en cada solicitud para demostrar quién es, y ambos servidores lo entienden porque comparten la misma clave secreta.</w:t>
+        <w:t xml:space="preserve">Cuando alguien inicia sesión, el servidor de C# le da un token. Ese token es como un pase de </w:t>
+      </w:r>
+      <w:r>
+        <w:rPr>
+          <w:rFonts w:ascii="Times New Roman" w:eastAsia="Times New Roman" w:hAnsi="Times New Roman" w:cs="Times New Roman"/>
+          <w:color w:val="000000" w:themeColor="text1"/>
+          <w:kern w:val="0"/>
+          <w:lang w:eastAsia="es-MX"/>
+          <w14:ligatures w14:val="none"/>
+        </w:rPr>
+        <w:t xml:space="preserve">                        </w:t>
+      </w:r>
+      <w:r>
+        <w:rPr>
+          <w:rFonts w:ascii="Times New Roman" w:eastAsia="Times New Roman" w:hAnsi="Times New Roman" w:cs="Times New Roman"/>
+          <w:color w:val="000000" w:themeColor="text1"/>
+          <w:kern w:val="0"/>
+          <w:lang w:eastAsia="es-MX"/>
+          <w14:ligatures w14:val="none"/>
+        </w:rPr>
+        <w:t xml:space="preserve"> que el usuario manda en cada solicitud para demostrar quién es, y ambos servidores lo entienden porque comparten la misma clave secreta.</w:t>
       </w:r>
     </w:p>
     <w:p>
@@ -264,7 +328,7 @@
           <w:lang w:eastAsia="es-MX"/>
         </w:rPr>
         <w:pict w14:anchorId="6F3ED45F">
-          <v:rect id="_x0000_i1032" alt="" style="width:441.9pt;height:.05pt;mso-width-percent:0;mso-height-percent:0;mso-width-percent:0;mso-height-percent:0" o:hralign="center" o:hrstd="t" o:hr="t" fillcolor="#a0a0a0" stroked="f"/>
+          <v:rect id="_x0000_i1025" alt="" style="width:441.9pt;height:.05pt;mso-width-percent:0;mso-height-percent:0;mso-width-percent:0;mso-height-percent:0" o:hralign="center" o:hrstd="t" o:hr="t" fillcolor="#a0a0a0" stroked="f"/>
         </w:pict>
       </w:r>
     </w:p>
@@ -320,6 +384,7 @@
         </w:rPr>
         <w:t>Primero hay que levantar las bases de datos con Docker. Desde la carpeta del proyecto ejecutar: </w:t>
       </w:r>
+      <w:proofErr w:type="spellStart"/>
       <w:r>
         <w:rPr>
           <w:rFonts w:ascii="Courier New" w:eastAsia="Times New Roman" w:hAnsi="Courier New" w:cs="Courier New"/>
@@ -330,52 +395,9 @@
           <w:lang w:eastAsia="es-MX"/>
           <w14:ligatures w14:val="none"/>
         </w:rPr>
-        <w:t>docker compose up -d</w:t>
-      </w:r>
-    </w:p>
-    <w:p>
-      <w:pPr>
-        <w:spacing w:before="100" w:beforeAutospacing="1" w:after="100" w:afterAutospacing="1" w:line="240" w:lineRule="auto"/>
-        <w:rPr>
-          <w:rFonts w:ascii="Times New Roman" w:eastAsia="Times New Roman" w:hAnsi="Times New Roman" w:cs="Times New Roman"/>
-          <w:color w:val="000000" w:themeColor="text1"/>
-          <w:kern w:val="0"/>
-          <w:lang w:eastAsia="es-MX"/>
-          <w14:ligatures w14:val="none"/>
-        </w:rPr>
-      </w:pPr>
-      <w:r>
-        <w:rPr>
-          <w:rFonts w:ascii="Times New Roman" w:eastAsia="Times New Roman" w:hAnsi="Times New Roman" w:cs="Times New Roman"/>
-          <w:color w:val="000000" w:themeColor="text1"/>
-          <w:kern w:val="0"/>
-          <w:lang w:eastAsia="es-MX"/>
-          <w14:ligatures w14:val="none"/>
-        </w:rPr>
-        <w:t>Esto levanta PostgreSQL (base de datos del servidor C#) y MongoDB (base de datos del servidor Node.js).</w:t>
-      </w:r>
-    </w:p>
-    <w:p>
-      <w:pPr>
-        <w:spacing w:before="100" w:beforeAutospacing="1" w:after="100" w:afterAutospacing="1" w:line="240" w:lineRule="auto"/>
-        <w:rPr>
-          <w:rFonts w:ascii="Times New Roman" w:eastAsia="Times New Roman" w:hAnsi="Times New Roman" w:cs="Times New Roman"/>
-          <w:color w:val="000000" w:themeColor="text1"/>
-          <w:kern w:val="0"/>
-          <w:lang w:eastAsia="es-MX"/>
-          <w14:ligatures w14:val="none"/>
-        </w:rPr>
-      </w:pPr>
-      <w:r>
-        <w:rPr>
-          <w:rFonts w:ascii="Times New Roman" w:eastAsia="Times New Roman" w:hAnsi="Times New Roman" w:cs="Times New Roman"/>
-          <w:color w:val="000000" w:themeColor="text1"/>
-          <w:kern w:val="0"/>
-          <w:lang w:eastAsia="es-MX"/>
-          <w14:ligatures w14:val="none"/>
-        </w:rPr>
-        <w:t>Luego instalar las dependencias de Node.js: </w:t>
-      </w:r>
+        <w:t>docker</w:t>
+      </w:r>
+      <w:proofErr w:type="spellEnd"/>
       <w:r>
         <w:rPr>
           <w:rFonts w:ascii="Courier New" w:eastAsia="Times New Roman" w:hAnsi="Courier New" w:cs="Courier New"/>
@@ -386,30 +408,9 @@
           <w:lang w:eastAsia="es-MX"/>
           <w14:ligatures w14:val="none"/>
         </w:rPr>
-        <w:t>pnpm install</w:t>
-      </w:r>
-    </w:p>
-    <w:p>
-      <w:pPr>
-        <w:spacing w:before="100" w:beforeAutospacing="1" w:after="100" w:afterAutospacing="1" w:line="240" w:lineRule="auto"/>
-        <w:rPr>
-          <w:rFonts w:ascii="Times New Roman" w:eastAsia="Times New Roman" w:hAnsi="Times New Roman" w:cs="Times New Roman"/>
-          <w:color w:val="000000" w:themeColor="text1"/>
-          <w:kern w:val="0"/>
-          <w:lang w:eastAsia="es-MX"/>
-          <w14:ligatures w14:val="none"/>
-        </w:rPr>
-      </w:pPr>
-      <w:r>
-        <w:rPr>
-          <w:rFonts w:ascii="Times New Roman" w:eastAsia="Times New Roman" w:hAnsi="Times New Roman" w:cs="Times New Roman"/>
-          <w:color w:val="000000" w:themeColor="text1"/>
-          <w:kern w:val="0"/>
-          <w:lang w:eastAsia="es-MX"/>
-          <w14:ligatures w14:val="none"/>
-        </w:rPr>
-        <w:t>Iniciar el servidor Node.js: </w:t>
-      </w:r>
+        <w:t xml:space="preserve"> </w:t>
+      </w:r>
+      <w:proofErr w:type="spellStart"/>
       <w:r>
         <w:rPr>
           <w:rFonts w:ascii="Courier New" w:eastAsia="Times New Roman" w:hAnsi="Courier New" w:cs="Courier New"/>
@@ -420,30 +421,9 @@
           <w:lang w:eastAsia="es-MX"/>
           <w14:ligatures w14:val="none"/>
         </w:rPr>
-        <w:t>pnpm run dev</w:t>
-      </w:r>
-    </w:p>
-    <w:p>
-      <w:pPr>
-        <w:spacing w:before="100" w:beforeAutospacing="1" w:after="100" w:afterAutospacing="1" w:line="240" w:lineRule="auto"/>
-        <w:rPr>
-          <w:rFonts w:ascii="Times New Roman" w:eastAsia="Times New Roman" w:hAnsi="Times New Roman" w:cs="Times New Roman"/>
-          <w:color w:val="000000" w:themeColor="text1"/>
-          <w:kern w:val="0"/>
-          <w:lang w:eastAsia="es-MX"/>
-          <w14:ligatures w14:val="none"/>
-        </w:rPr>
-      </w:pPr>
-      <w:r>
-        <w:rPr>
-          <w:rFonts w:ascii="Times New Roman" w:eastAsia="Times New Roman" w:hAnsi="Times New Roman" w:cs="Times New Roman"/>
-          <w:color w:val="000000" w:themeColor="text1"/>
-          <w:kern w:val="0"/>
-          <w:lang w:eastAsia="es-MX"/>
-          <w14:ligatures w14:val="none"/>
-        </w:rPr>
-        <w:t>Iniciar el servidor C# desde la carpeta AuthServiceBanco.Api: </w:t>
-      </w:r>
+        <w:t>compose</w:t>
+      </w:r>
+      <w:proofErr w:type="spellEnd"/>
       <w:r>
         <w:rPr>
           <w:rFonts w:ascii="Courier New" w:eastAsia="Times New Roman" w:hAnsi="Courier New" w:cs="Courier New"/>
@@ -454,7 +434,223 @@
           <w:lang w:eastAsia="es-MX"/>
           <w14:ligatures w14:val="none"/>
         </w:rPr>
-        <w:t>dotnet run</w:t>
+        <w:t xml:space="preserve"> up -d</w:t>
+      </w:r>
+    </w:p>
+    <w:p>
+      <w:pPr>
+        <w:spacing w:before="100" w:beforeAutospacing="1" w:after="100" w:afterAutospacing="1" w:line="240" w:lineRule="auto"/>
+        <w:rPr>
+          <w:rFonts w:ascii="Times New Roman" w:eastAsia="Times New Roman" w:hAnsi="Times New Roman" w:cs="Times New Roman"/>
+          <w:color w:val="000000" w:themeColor="text1"/>
+          <w:kern w:val="0"/>
+          <w:lang w:eastAsia="es-MX"/>
+          <w14:ligatures w14:val="none"/>
+        </w:rPr>
+      </w:pPr>
+      <w:r>
+        <w:rPr>
+          <w:rFonts w:ascii="Times New Roman" w:eastAsia="Times New Roman" w:hAnsi="Times New Roman" w:cs="Times New Roman"/>
+          <w:color w:val="000000" w:themeColor="text1"/>
+          <w:kern w:val="0"/>
+          <w:lang w:eastAsia="es-MX"/>
+          <w14:ligatures w14:val="none"/>
+        </w:rPr>
+        <w:t>Esto levanta PostgreSQL (base de datos del servidor C#) y MongoDB (base de datos del servidor Node.js).</w:t>
+      </w:r>
+    </w:p>
+    <w:p>
+      <w:pPr>
+        <w:spacing w:before="100" w:beforeAutospacing="1" w:after="100" w:afterAutospacing="1" w:line="240" w:lineRule="auto"/>
+        <w:rPr>
+          <w:rFonts w:ascii="Times New Roman" w:eastAsia="Times New Roman" w:hAnsi="Times New Roman" w:cs="Times New Roman"/>
+          <w:color w:val="000000" w:themeColor="text1"/>
+          <w:kern w:val="0"/>
+          <w:lang w:eastAsia="es-MX"/>
+          <w14:ligatures w14:val="none"/>
+        </w:rPr>
+      </w:pPr>
+      <w:r>
+        <w:rPr>
+          <w:rFonts w:ascii="Times New Roman" w:eastAsia="Times New Roman" w:hAnsi="Times New Roman" w:cs="Times New Roman"/>
+          <w:color w:val="000000" w:themeColor="text1"/>
+          <w:kern w:val="0"/>
+          <w:lang w:eastAsia="es-MX"/>
+          <w14:ligatures w14:val="none"/>
+        </w:rPr>
+        <w:t>Luego instalar las dependencias de Node.js: </w:t>
+      </w:r>
+      <w:proofErr w:type="spellStart"/>
+      <w:r>
+        <w:rPr>
+          <w:rFonts w:ascii="Courier New" w:eastAsia="Times New Roman" w:hAnsi="Courier New" w:cs="Courier New"/>
+          <w:color w:val="000000" w:themeColor="text1"/>
+          <w:kern w:val="0"/>
+          <w:sz w:val="20"/>
+          <w:szCs w:val="20"/>
+          <w:lang w:eastAsia="es-MX"/>
+          <w14:ligatures w14:val="none"/>
+        </w:rPr>
+        <w:t>pnpm</w:t>
+      </w:r>
+      <w:proofErr w:type="spellEnd"/>
+      <w:r>
+        <w:rPr>
+          <w:rFonts w:ascii="Courier New" w:eastAsia="Times New Roman" w:hAnsi="Courier New" w:cs="Courier New"/>
+          <w:color w:val="000000" w:themeColor="text1"/>
+          <w:kern w:val="0"/>
+          <w:sz w:val="20"/>
+          <w:szCs w:val="20"/>
+          <w:lang w:eastAsia="es-MX"/>
+          <w14:ligatures w14:val="none"/>
+        </w:rPr>
+        <w:t xml:space="preserve"> </w:t>
+      </w:r>
+      <w:proofErr w:type="spellStart"/>
+      <w:r>
+        <w:rPr>
+          <w:rFonts w:ascii="Courier New" w:eastAsia="Times New Roman" w:hAnsi="Courier New" w:cs="Courier New"/>
+          <w:color w:val="000000" w:themeColor="text1"/>
+          <w:kern w:val="0"/>
+          <w:sz w:val="20"/>
+          <w:szCs w:val="20"/>
+          <w:lang w:eastAsia="es-MX"/>
+          <w14:ligatures w14:val="none"/>
+        </w:rPr>
+        <w:t>install</w:t>
+      </w:r>
+      <w:proofErr w:type="spellEnd"/>
+    </w:p>
+    <w:p>
+      <w:pPr>
+        <w:spacing w:before="100" w:beforeAutospacing="1" w:after="100" w:afterAutospacing="1" w:line="240" w:lineRule="auto"/>
+        <w:rPr>
+          <w:rFonts w:ascii="Times New Roman" w:eastAsia="Times New Roman" w:hAnsi="Times New Roman" w:cs="Times New Roman"/>
+          <w:color w:val="000000" w:themeColor="text1"/>
+          <w:kern w:val="0"/>
+          <w:lang w:eastAsia="es-MX"/>
+          <w14:ligatures w14:val="none"/>
+        </w:rPr>
+      </w:pPr>
+      <w:r>
+        <w:rPr>
+          <w:rFonts w:ascii="Times New Roman" w:eastAsia="Times New Roman" w:hAnsi="Times New Roman" w:cs="Times New Roman"/>
+          <w:color w:val="000000" w:themeColor="text1"/>
+          <w:kern w:val="0"/>
+          <w:lang w:eastAsia="es-MX"/>
+          <w14:ligatures w14:val="none"/>
+        </w:rPr>
+        <w:t>Iniciar el servidor Node.js: </w:t>
+      </w:r>
+      <w:proofErr w:type="spellStart"/>
+      <w:r>
+        <w:rPr>
+          <w:rFonts w:ascii="Courier New" w:eastAsia="Times New Roman" w:hAnsi="Courier New" w:cs="Courier New"/>
+          <w:color w:val="000000" w:themeColor="text1"/>
+          <w:kern w:val="0"/>
+          <w:sz w:val="20"/>
+          <w:szCs w:val="20"/>
+          <w:lang w:eastAsia="es-MX"/>
+          <w14:ligatures w14:val="none"/>
+        </w:rPr>
+        <w:t>pnpm</w:t>
+      </w:r>
+      <w:proofErr w:type="spellEnd"/>
+      <w:r>
+        <w:rPr>
+          <w:rFonts w:ascii="Courier New" w:eastAsia="Times New Roman" w:hAnsi="Courier New" w:cs="Courier New"/>
+          <w:color w:val="000000" w:themeColor="text1"/>
+          <w:kern w:val="0"/>
+          <w:sz w:val="20"/>
+          <w:szCs w:val="20"/>
+          <w:lang w:eastAsia="es-MX"/>
+          <w14:ligatures w14:val="none"/>
+        </w:rPr>
+        <w:t xml:space="preserve"> run </w:t>
+      </w:r>
+      <w:proofErr w:type="spellStart"/>
+      <w:r>
+        <w:rPr>
+          <w:rFonts w:ascii="Courier New" w:eastAsia="Times New Roman" w:hAnsi="Courier New" w:cs="Courier New"/>
+          <w:color w:val="000000" w:themeColor="text1"/>
+          <w:kern w:val="0"/>
+          <w:sz w:val="20"/>
+          <w:szCs w:val="20"/>
+          <w:lang w:eastAsia="es-MX"/>
+          <w14:ligatures w14:val="none"/>
+        </w:rPr>
+        <w:t>dev</w:t>
+      </w:r>
+      <w:proofErr w:type="spellEnd"/>
+    </w:p>
+    <w:p>
+      <w:pPr>
+        <w:spacing w:before="100" w:beforeAutospacing="1" w:after="100" w:afterAutospacing="1" w:line="240" w:lineRule="auto"/>
+        <w:rPr>
+          <w:rFonts w:ascii="Times New Roman" w:eastAsia="Times New Roman" w:hAnsi="Times New Roman" w:cs="Times New Roman"/>
+          <w:color w:val="000000" w:themeColor="text1"/>
+          <w:kern w:val="0"/>
+          <w:lang w:eastAsia="es-MX"/>
+          <w14:ligatures w14:val="none"/>
+        </w:rPr>
+      </w:pPr>
+      <w:r>
+        <w:rPr>
+          <w:rFonts w:ascii="Times New Roman" w:eastAsia="Times New Roman" w:hAnsi="Times New Roman" w:cs="Times New Roman"/>
+          <w:color w:val="000000" w:themeColor="text1"/>
+          <w:kern w:val="0"/>
+          <w:lang w:eastAsia="es-MX"/>
+          <w14:ligatures w14:val="none"/>
+        </w:rPr>
+        <w:t xml:space="preserve">Iniciar el servidor C# desde la carpeta </w:t>
+      </w:r>
+      <w:proofErr w:type="spellStart"/>
+      <w:r>
+        <w:rPr>
+          <w:rFonts w:ascii="Times New Roman" w:eastAsia="Times New Roman" w:hAnsi="Times New Roman" w:cs="Times New Roman"/>
+          <w:color w:val="000000" w:themeColor="text1"/>
+          <w:kern w:val="0"/>
+          <w:lang w:eastAsia="es-MX"/>
+          <w14:ligatures w14:val="none"/>
+        </w:rPr>
+        <w:t>AuthServiceBanco.Api</w:t>
+      </w:r>
+      <w:proofErr w:type="spellEnd"/>
+      <w:r>
+        <w:rPr>
+          <w:rFonts w:ascii="Times New Roman" w:eastAsia="Times New Roman" w:hAnsi="Times New Roman" w:cs="Times New Roman"/>
+          <w:color w:val="000000" w:themeColor="text1"/>
+          <w:kern w:val="0"/>
+          <w:lang w:eastAsia="es-MX"/>
+          <w14:ligatures w14:val="none"/>
+        </w:rPr>
+        <w:t>: </w:t>
+      </w:r>
+      <w:proofErr w:type="spellStart"/>
+      <w:r>
+        <w:rPr>
+          <w:rFonts w:ascii="Courier New" w:eastAsia="Times New Roman" w:hAnsi="Courier New" w:cs="Courier New"/>
+          <w:color w:val="000000" w:themeColor="text1"/>
+          <w:kern w:val="0"/>
+          <w:sz w:val="20"/>
+          <w:szCs w:val="20"/>
+          <w:lang w:eastAsia="es-MX"/>
+          <w14:ligatures w14:val="none"/>
+        </w:rPr>
+        <w:t>dotnet</w:t>
+      </w:r>
+      <w:proofErr w:type="spellEnd"/>
+      <w:r>
+        <w:rPr>
+          <w:rFonts w:ascii="Courier New" w:eastAsia="Times New Roman" w:hAnsi="Courier New" w:cs="Courier New"/>
+          <w:color w:val="000000" w:themeColor="text1"/>
+          <w:kern w:val="0"/>
+          <w:sz w:val="20"/>
+          <w:szCs w:val="20"/>
+          <w:lang w:eastAsia="es-MX"/>
+          <w14:ligatures w14:val="none"/>
+        </w:rPr>
+        <w:t xml:space="preserve"> run</w:t>
       </w:r>
     </w:p>
     <w:p>
@@ -600,7 +796,7 @@
           <w:lang w:eastAsia="es-MX"/>
         </w:rPr>
         <w:pict w14:anchorId="31696B33">
-          <v:rect id="_x0000_i1031" alt="" style="width:441.9pt;height:.05pt;mso-width-percent:0;mso-height-percent:0;mso-width-percent:0;mso-height-percent:0" o:hralign="center" o:hrstd="t" o:hr="t" fillcolor="#a0a0a0" stroked="f"/>
+          <v:rect id="_x0000_i1026" alt="" style="width:441.9pt;height:.05pt;mso-width-percent:0;mso-height-percent:0;mso-width-percent:0;mso-height-percent:0" o:hralign="center" o:hrstd="t" o:hr="t" fillcolor="#a0a0a0" stroked="f"/>
         </w:pict>
       </w:r>
     </w:p>
@@ -676,8 +872,53 @@
           <w:lang w:eastAsia="es-MX"/>
           <w14:ligatures w14:val="none"/>
         </w:rPr>
-        <w:t>Para usar cualquier endpoint protegido hay que poner ese token en el header de la solicitud así: </w:t>
-      </w:r>
+        <w:t xml:space="preserve">Para usar cualquier </w:t>
+      </w:r>
+      <w:proofErr w:type="spellStart"/>
+      <w:r>
+        <w:rPr>
+          <w:rFonts w:ascii="Times New Roman" w:eastAsia="Times New Roman" w:hAnsi="Times New Roman" w:cs="Times New Roman"/>
+          <w:color w:val="000000" w:themeColor="text1"/>
+          <w:kern w:val="0"/>
+          <w:lang w:eastAsia="es-MX"/>
+          <w14:ligatures w14:val="none"/>
+        </w:rPr>
+        <w:t>endpoint</w:t>
+      </w:r>
+      <w:proofErr w:type="spellEnd"/>
+      <w:r>
+        <w:rPr>
+          <w:rFonts w:ascii="Times New Roman" w:eastAsia="Times New Roman" w:hAnsi="Times New Roman" w:cs="Times New Roman"/>
+          <w:color w:val="000000" w:themeColor="text1"/>
+          <w:kern w:val="0"/>
+          <w:lang w:eastAsia="es-MX"/>
+          <w14:ligatures w14:val="none"/>
+        </w:rPr>
+        <w:t xml:space="preserve"> protegido hay que poner ese token en el </w:t>
+      </w:r>
+      <w:proofErr w:type="spellStart"/>
+      <w:r>
+        <w:rPr>
+          <w:rFonts w:ascii="Times New Roman" w:eastAsia="Times New Roman" w:hAnsi="Times New Roman" w:cs="Times New Roman"/>
+          <w:color w:val="000000" w:themeColor="text1"/>
+          <w:kern w:val="0"/>
+          <w:lang w:eastAsia="es-MX"/>
+          <w14:ligatures w14:val="none"/>
+        </w:rPr>
+        <w:t>header</w:t>
+      </w:r>
+      <w:proofErr w:type="spellEnd"/>
+      <w:r>
+        <w:rPr>
+          <w:rFonts w:ascii="Times New Roman" w:eastAsia="Times New Roman" w:hAnsi="Times New Roman" w:cs="Times New Roman"/>
+          <w:color w:val="000000" w:themeColor="text1"/>
+          <w:kern w:val="0"/>
+          <w:lang w:eastAsia="es-MX"/>
+          <w14:ligatures w14:val="none"/>
+        </w:rPr>
+        <w:t xml:space="preserve"> de la solicitud así: </w:t>
+      </w:r>
+      <w:proofErr w:type="spellStart"/>
       <w:r>
         <w:rPr>
           <w:rFonts w:ascii="Courier New" w:eastAsia="Times New Roman" w:hAnsi="Courier New" w:cs="Courier New"/>
@@ -688,7 +929,46 @@
           <w:lang w:eastAsia="es-MX"/>
           <w14:ligatures w14:val="none"/>
         </w:rPr>
-        <w:t>Authorization: Bearer {el token aquí}</w:t>
+        <w:t>Authorization</w:t>
+      </w:r>
+      <w:proofErr w:type="spellEnd"/>
+      <w:r>
+        <w:rPr>
+          <w:rFonts w:ascii="Courier New" w:eastAsia="Times New Roman" w:hAnsi="Courier New" w:cs="Courier New"/>
+          <w:color w:val="000000" w:themeColor="text1"/>
+          <w:kern w:val="0"/>
+          <w:sz w:val="20"/>
+          <w:szCs w:val="20"/>
+          <w:lang w:eastAsia="es-MX"/>
+          <w14:ligatures w14:val="none"/>
+        </w:rPr>
+        <w:t xml:space="preserve">: </w:t>
+      </w:r>
+      <w:proofErr w:type="spellStart"/>
+      <w:r>
+        <w:rPr>
+          <w:rFonts w:ascii="Courier New" w:eastAsia="Times New Roman" w:hAnsi="Courier New" w:cs="Courier New"/>
+          <w:color w:val="000000" w:themeColor="text1"/>
+          <w:kern w:val="0"/>
+          <w:sz w:val="20"/>
+          <w:szCs w:val="20"/>
+          <w:lang w:eastAsia="es-MX"/>
+          <w14:ligatures w14:val="none"/>
+        </w:rPr>
+        <w:t>Bearer</w:t>
+      </w:r>
+      <w:proofErr w:type="spellEnd"/>
+      <w:r>
+        <w:rPr>
+          <w:rFonts w:ascii="Courier New" w:eastAsia="Times New Roman" w:hAnsi="Courier New" w:cs="Courier New"/>
+          <w:color w:val="000000" w:themeColor="text1"/>
+          <w:kern w:val="0"/>
+          <w:sz w:val="20"/>
+          <w:szCs w:val="20"/>
+          <w:lang w:eastAsia="es-MX"/>
+          <w14:ligatures w14:val="none"/>
+        </w:rPr>
+        <w:t xml:space="preserve"> {el token aquí}</w:t>
       </w:r>
     </w:p>
     <w:p>
@@ -755,7 +1035,7 @@
           <w:lang w:eastAsia="es-MX"/>
         </w:rPr>
         <w:pict w14:anchorId="265F828D">
-          <v:rect id="_x0000_i1030" alt="" style="width:441.9pt;height:.05pt;mso-width-percent:0;mso-height-percent:0;mso-width-percent:0;mso-height-percent:0" o:hralign="center" o:hrstd="t" o:hr="t" fillcolor="#a0a0a0" stroked="f"/>
+          <v:rect id="_x0000_i1027" alt="" style="width:441.9pt;height:.05pt;mso-width-percent:0;mso-height-percent:0;mso-width-percent:0;mso-height-percent:0" o:hralign="center" o:hrstd="t" o:hr="t" fillcolor="#a0a0a0" stroked="f"/>
         </w:pict>
       </w:r>
     </w:p>
@@ -878,7 +1158,7 @@
           <w:lang w:eastAsia="es-MX"/>
         </w:rPr>
         <w:pict w14:anchorId="528B10B4">
-          <v:rect id="_x0000_i1029" alt="" style="width:441.9pt;height:.05pt;mso-width-percent:0;mso-height-percent:0;mso-width-percent:0;mso-height-percent:0" o:hralign="center" o:hrstd="t" o:hr="t" fillcolor="#a0a0a0" stroked="f"/>
+          <v:rect id="_x0000_i1028" alt="" style="width:441.9pt;height:.05pt;mso-width-percent:0;mso-height-percent:0;mso-width-percent:0;mso-height-percent:0" o:hralign="center" o:hrstd="t" o:hr="t" fillcolor="#a0a0a0" stroked="f"/>
         </w:pict>
       </w:r>
     </w:p>
@@ -967,31 +1247,101 @@
           <w:lang w:eastAsia="es-MX"/>
           <w14:ligatures w14:val="none"/>
         </w:rPr>
-        <w:t> sin token, mandando sus datos personales: nombre, apellido, username, email, contraseña, teléfono, DPI, dirección, trabajo e ingresos mensuales. El sistema crea la cuenta pero la deja inactiva.</w:t>
-      </w:r>
-    </w:p>
-    <w:p>
-      <w:pPr>
-        <w:spacing w:before="100" w:beforeAutospacing="1" w:after="100" w:afterAutospacing="1" w:line="240" w:lineRule="auto"/>
-        <w:rPr>
-          <w:rFonts w:ascii="Times New Roman" w:eastAsia="Times New Roman" w:hAnsi="Times New Roman" w:cs="Times New Roman"/>
-          <w:color w:val="000000" w:themeColor="text1"/>
-          <w:kern w:val="0"/>
-          <w:lang w:eastAsia="es-MX"/>
-          <w14:ligatures w14:val="none"/>
-        </w:rPr>
-      </w:pPr>
-      <w:r>
-        <w:rPr>
-          <w:rFonts w:ascii="Times New Roman" w:eastAsia="Times New Roman" w:hAnsi="Times New Roman" w:cs="Times New Roman"/>
-          <w:b/>
-          <w:bCs/>
-          <w:color w:val="000000" w:themeColor="text1"/>
-          <w:kern w:val="0"/>
-          <w:lang w:eastAsia="es-MX"/>
-          <w14:ligatures w14:val="none"/>
-        </w:rPr>
-        <w:t>Paso 2 — El admin activa la cuenta</w:t>
+        <w:t xml:space="preserve"> sin token, mandando sus datos personales: nombre, apellido, </w:t>
+      </w:r>
+      <w:proofErr w:type="spellStart"/>
+      <w:r>
+        <w:rPr>
+          <w:rFonts w:ascii="Times New Roman" w:eastAsia="Times New Roman" w:hAnsi="Times New Roman" w:cs="Times New Roman"/>
+          <w:color w:val="000000" w:themeColor="text1"/>
+          <w:kern w:val="0"/>
+          <w:lang w:eastAsia="es-MX"/>
+          <w14:ligatures w14:val="none"/>
+        </w:rPr>
+        <w:t>username</w:t>
+      </w:r>
+      <w:proofErr w:type="spellEnd"/>
+      <w:r>
+        <w:rPr>
+          <w:rFonts w:ascii="Times New Roman" w:eastAsia="Times New Roman" w:hAnsi="Times New Roman" w:cs="Times New Roman"/>
+          <w:color w:val="000000" w:themeColor="text1"/>
+          <w:kern w:val="0"/>
+          <w:lang w:eastAsia="es-MX"/>
+          <w14:ligatures w14:val="none"/>
+        </w:rPr>
+        <w:t xml:space="preserve">, email, contraseña, teléfono, DPI, dirección, trabajo e ingresos mensuales. El sistema crea la </w:t>
+      </w:r>
+      <w:proofErr w:type="gramStart"/>
+      <w:r>
+        <w:rPr>
+          <w:rFonts w:ascii="Times New Roman" w:eastAsia="Times New Roman" w:hAnsi="Times New Roman" w:cs="Times New Roman"/>
+          <w:color w:val="000000" w:themeColor="text1"/>
+          <w:kern w:val="0"/>
+          <w:lang w:eastAsia="es-MX"/>
+          <w14:ligatures w14:val="none"/>
+        </w:rPr>
+        <w:t>cuenta</w:t>
+      </w:r>
+      <w:proofErr w:type="gramEnd"/>
+      <w:r>
+        <w:rPr>
+          <w:rFonts w:ascii="Times New Roman" w:eastAsia="Times New Roman" w:hAnsi="Times New Roman" w:cs="Times New Roman"/>
+          <w:color w:val="000000" w:themeColor="text1"/>
+          <w:kern w:val="0"/>
+          <w:lang w:eastAsia="es-MX"/>
+          <w14:ligatures w14:val="none"/>
+        </w:rPr>
+        <w:t xml:space="preserve"> pero la deja inactiva.</w:t>
+      </w:r>
+    </w:p>
+    <w:p>
+      <w:pPr>
+        <w:spacing w:before="100" w:beforeAutospacing="1" w:after="100" w:afterAutospacing="1" w:line="240" w:lineRule="auto"/>
+        <w:rPr>
+          <w:rFonts w:ascii="Times New Roman" w:eastAsia="Times New Roman" w:hAnsi="Times New Roman" w:cs="Times New Roman"/>
+          <w:color w:val="000000" w:themeColor="text1"/>
+          <w:kern w:val="0"/>
+          <w:lang w:eastAsia="es-MX"/>
+          <w14:ligatures w14:val="none"/>
+        </w:rPr>
+      </w:pPr>
+      <w:r>
+        <w:rPr>
+          <w:rFonts w:ascii="Times New Roman" w:eastAsia="Times New Roman" w:hAnsi="Times New Roman" w:cs="Times New Roman"/>
+          <w:b/>
+          <w:bCs/>
+          <w:color w:val="000000" w:themeColor="text1"/>
+          <w:kern w:val="0"/>
+          <w:lang w:eastAsia="es-MX"/>
+          <w14:ligatures w14:val="none"/>
+        </w:rPr>
+        <w:t xml:space="preserve">Paso 2 — El </w:t>
+      </w:r>
+      <w:proofErr w:type="spellStart"/>
+      <w:r>
+        <w:rPr>
+          <w:rFonts w:ascii="Times New Roman" w:eastAsia="Times New Roman" w:hAnsi="Times New Roman" w:cs="Times New Roman"/>
+          <w:b/>
+          <w:bCs/>
+          <w:color w:val="000000" w:themeColor="text1"/>
+          <w:kern w:val="0"/>
+          <w:lang w:eastAsia="es-MX"/>
+          <w14:ligatures w14:val="none"/>
+        </w:rPr>
+        <w:t>admin</w:t>
+      </w:r>
+      <w:proofErr w:type="spellEnd"/>
+      <w:r>
+        <w:rPr>
+          <w:rFonts w:ascii="Times New Roman" w:eastAsia="Times New Roman" w:hAnsi="Times New Roman" w:cs="Times New Roman"/>
+          <w:b/>
+          <w:bCs/>
+          <w:color w:val="000000" w:themeColor="text1"/>
+          <w:kern w:val="0"/>
+          <w:lang w:eastAsia="es-MX"/>
+          <w14:ligatures w14:val="none"/>
+        </w:rPr>
+        <w:t xml:space="preserve"> activa la cuenta</w:t>
       </w:r>
       <w:r>
         <w:rPr>
@@ -1035,7 +1385,41 @@
           <w:lang w:eastAsia="es-MX"/>
           <w14:ligatures w14:val="none"/>
         </w:rPr>
-        <w:t> del usuario}/activate con su token. Esto activa la cuenta del usuario.</w:t>
+        <w:t xml:space="preserve"> del </w:t>
+      </w:r>
+      <w:proofErr w:type="gramStart"/>
+      <w:r>
+        <w:rPr>
+          <w:rFonts w:ascii="Times New Roman" w:eastAsia="Times New Roman" w:hAnsi="Times New Roman" w:cs="Times New Roman"/>
+          <w:color w:val="000000" w:themeColor="text1"/>
+          <w:kern w:val="0"/>
+          <w:lang w:eastAsia="es-MX"/>
+          <w14:ligatures w14:val="none"/>
+        </w:rPr>
+        <w:t>usuario}/</w:t>
+      </w:r>
+      <w:proofErr w:type="spellStart"/>
+      <w:proofErr w:type="gramEnd"/>
+      <w:r>
+        <w:rPr>
+          <w:rFonts w:ascii="Times New Roman" w:eastAsia="Times New Roman" w:hAnsi="Times New Roman" w:cs="Times New Roman"/>
+          <w:color w:val="000000" w:themeColor="text1"/>
+          <w:kern w:val="0"/>
+          <w:lang w:eastAsia="es-MX"/>
+          <w14:ligatures w14:val="none"/>
+        </w:rPr>
+        <w:t>activate</w:t>
+      </w:r>
+      <w:proofErr w:type="spellEnd"/>
+      <w:r>
+        <w:rPr>
+          <w:rFonts w:ascii="Times New Roman" w:eastAsia="Times New Roman" w:hAnsi="Times New Roman" w:cs="Times New Roman"/>
+          <w:color w:val="000000" w:themeColor="text1"/>
+          <w:kern w:val="0"/>
+          <w:lang w:eastAsia="es-MX"/>
+          <w14:ligatures w14:val="none"/>
+        </w:rPr>
+        <w:t xml:space="preserve"> con su token. Esto activa la cuenta del usuario.</w:t>
       </w:r>
     </w:p>
     <w:p>
@@ -1092,7 +1476,29 @@
           <w:lang w:eastAsia="es-MX"/>
           <w14:ligatures w14:val="none"/>
         </w:rPr>
-        <w:t> con su username y contraseña. Recibe su token JWT.</w:t>
+        <w:t xml:space="preserve"> con su </w:t>
+      </w:r>
+      <w:proofErr w:type="spellStart"/>
+      <w:r>
+        <w:rPr>
+          <w:rFonts w:ascii="Times New Roman" w:eastAsia="Times New Roman" w:hAnsi="Times New Roman" w:cs="Times New Roman"/>
+          <w:color w:val="000000" w:themeColor="text1"/>
+          <w:kern w:val="0"/>
+          <w:lang w:eastAsia="es-MX"/>
+          <w14:ligatures w14:val="none"/>
+        </w:rPr>
+        <w:t>username</w:t>
+      </w:r>
+      <w:proofErr w:type="spellEnd"/>
+      <w:r>
+        <w:rPr>
+          <w:rFonts w:ascii="Times New Roman" w:eastAsia="Times New Roman" w:hAnsi="Times New Roman" w:cs="Times New Roman"/>
+          <w:color w:val="000000" w:themeColor="text1"/>
+          <w:kern w:val="0"/>
+          <w:lang w:eastAsia="es-MX"/>
+          <w14:ligatures w14:val="none"/>
+        </w:rPr>
+        <w:t xml:space="preserve"> y contraseña. Recibe su token JWT.</w:t>
       </w:r>
     </w:p>
     <w:p>
@@ -1173,7 +1579,33 @@
           <w:lang w:eastAsia="es-MX"/>
           <w14:ligatures w14:val="none"/>
         </w:rPr>
-        <w:t>Paso 5 — El admin activa la cuenta bancaria</w:t>
+        <w:t xml:space="preserve">Paso 5 — El </w:t>
+      </w:r>
+      <w:proofErr w:type="spellStart"/>
+      <w:r>
+        <w:rPr>
+          <w:rFonts w:ascii="Times New Roman" w:eastAsia="Times New Roman" w:hAnsi="Times New Roman" w:cs="Times New Roman"/>
+          <w:b/>
+          <w:bCs/>
+          <w:color w:val="000000" w:themeColor="text1"/>
+          <w:kern w:val="0"/>
+          <w:lang w:eastAsia="es-MX"/>
+          <w14:ligatures w14:val="none"/>
+        </w:rPr>
+        <w:t>admin</w:t>
+      </w:r>
+      <w:proofErr w:type="spellEnd"/>
+      <w:r>
+        <w:rPr>
+          <w:rFonts w:ascii="Times New Roman" w:eastAsia="Times New Roman" w:hAnsi="Times New Roman" w:cs="Times New Roman"/>
+          <w:b/>
+          <w:bCs/>
+          <w:color w:val="000000" w:themeColor="text1"/>
+          <w:kern w:val="0"/>
+          <w:lang w:eastAsia="es-MX"/>
+          <w14:ligatures w14:val="none"/>
+        </w:rPr>
+        <w:t xml:space="preserve"> activa la cuenta bancaria</w:t>
       </w:r>
       <w:r>
         <w:rPr>
@@ -1206,7 +1638,41 @@
           <w:lang w:eastAsia="es-MX"/>
           <w14:ligatures w14:val="none"/>
         </w:rPr>
-        <w:t> de la cuenta}/activate. La cuenta queda ACTIVA y el usuario ya puede operar.</w:t>
+        <w:t xml:space="preserve"> de la </w:t>
+      </w:r>
+      <w:proofErr w:type="gramStart"/>
+      <w:r>
+        <w:rPr>
+          <w:rFonts w:ascii="Times New Roman" w:eastAsia="Times New Roman" w:hAnsi="Times New Roman" w:cs="Times New Roman"/>
+          <w:color w:val="000000" w:themeColor="text1"/>
+          <w:kern w:val="0"/>
+          <w:lang w:eastAsia="es-MX"/>
+          <w14:ligatures w14:val="none"/>
+        </w:rPr>
+        <w:t>cuenta}/</w:t>
+      </w:r>
+      <w:proofErr w:type="spellStart"/>
+      <w:proofErr w:type="gramEnd"/>
+      <w:r>
+        <w:rPr>
+          <w:rFonts w:ascii="Times New Roman" w:eastAsia="Times New Roman" w:hAnsi="Times New Roman" w:cs="Times New Roman"/>
+          <w:color w:val="000000" w:themeColor="text1"/>
+          <w:kern w:val="0"/>
+          <w:lang w:eastAsia="es-MX"/>
+          <w14:ligatures w14:val="none"/>
+        </w:rPr>
+        <w:t>activate</w:t>
+      </w:r>
+      <w:proofErr w:type="spellEnd"/>
+      <w:r>
+        <w:rPr>
+          <w:rFonts w:ascii="Times New Roman" w:eastAsia="Times New Roman" w:hAnsi="Times New Roman" w:cs="Times New Roman"/>
+          <w:color w:val="000000" w:themeColor="text1"/>
+          <w:kern w:val="0"/>
+          <w:lang w:eastAsia="es-MX"/>
+          <w14:ligatures w14:val="none"/>
+        </w:rPr>
+        <w:t>. La cuenta queda ACTIVA y el usuario ya puede operar.</w:t>
       </w:r>
     </w:p>
     <w:p>
@@ -1229,7 +1695,7 @@
           <w:lang w:eastAsia="es-MX"/>
         </w:rPr>
         <w:pict w14:anchorId="0DC7DEE4">
-          <v:rect id="_x0000_i1028" alt="" style="width:441.9pt;height:.05pt;mso-width-percent:0;mso-height-percent:0;mso-width-percent:0;mso-height-percent:0" o:hralign="center" o:hrstd="t" o:hr="t" fillcolor="#a0a0a0" stroked="f"/>
+          <v:rect id="_x0000_i1029" alt="" style="width:441.9pt;height:.05pt;mso-width-percent:0;mso-height-percent:0;mso-width-percent:0;mso-height-percent:0" o:hralign="center" o:hrstd="t" o:hr="t" fillcolor="#a0a0a0" stroked="f"/>
         </w:pict>
       </w:r>
     </w:p>
@@ -1489,7 +1955,29 @@
           <w:lang w:eastAsia="es-MX"/>
           <w14:ligatures w14:val="none"/>
         </w:rPr>
-        <w:t> con su token. Se puede filtrar por tipo de transacción y rango de fechas.</w:t>
+        <w:t xml:space="preserve"> con </w:t>
+      </w:r>
+      <w:proofErr w:type="spellStart"/>
+      <w:r>
+        <w:rPr>
+          <w:rFonts w:ascii="Times New Roman" w:eastAsia="Times New Roman" w:hAnsi="Times New Roman" w:cs="Times New Roman"/>
+          <w:color w:val="000000" w:themeColor="text1"/>
+          <w:kern w:val="0"/>
+          <w:lang w:eastAsia="es-MX"/>
+          <w14:ligatures w14:val="none"/>
+        </w:rPr>
+        <w:t>su</w:t>
+      </w:r>
+      <w:proofErr w:type="spellEnd"/>
+      <w:r>
+        <w:rPr>
+          <w:rFonts w:ascii="Times New Roman" w:eastAsia="Times New Roman" w:hAnsi="Times New Roman" w:cs="Times New Roman"/>
+          <w:color w:val="000000" w:themeColor="text1"/>
+          <w:kern w:val="0"/>
+          <w:lang w:eastAsia="es-MX"/>
+          <w14:ligatures w14:val="none"/>
+        </w:rPr>
+        <w:t xml:space="preserve"> token. Se puede filtrar por tipo de transacción y rango de fechas.</w:t>
       </w:r>
     </w:p>
     <w:p>
@@ -1626,7 +2114,7 @@
           <w:lang w:eastAsia="es-MX"/>
         </w:rPr>
         <w:pict w14:anchorId="040D520C">
-          <v:rect id="_x0000_i1027" alt="" style="width:441.9pt;height:.05pt;mso-width-percent:0;mso-height-percent:0;mso-width-percent:0;mso-height-percent:0" o:hralign="center" o:hrstd="t" o:hr="t" fillcolor="#a0a0a0" stroked="f"/>
+          <v:rect id="_x0000_i1030" alt="" style="width:441.9pt;height:.05pt;mso-width-percent:0;mso-height-percent:0;mso-width-percent:0;mso-height-percent:0" o:hralign="center" o:hrstd="t" o:hr="t" fillcolor="#a0a0a0" stroked="f"/>
         </w:pict>
       </w:r>
     </w:p>
@@ -1681,7 +2169,29 @@
           <w:lang w:eastAsia="es-MX"/>
           <w14:ligatures w14:val="none"/>
         </w:rPr>
-        <w:t>El administrador puede hacer todo lo que el usuario puede y además:</w:t>
+        <w:t xml:space="preserve">El administrador puede hacer todo lo que el usuario puede </w:t>
+      </w:r>
+      <w:proofErr w:type="gramStart"/>
+      <w:r>
+        <w:rPr>
+          <w:rFonts w:ascii="Times New Roman" w:eastAsia="Times New Roman" w:hAnsi="Times New Roman" w:cs="Times New Roman"/>
+          <w:color w:val="000000" w:themeColor="text1"/>
+          <w:kern w:val="0"/>
+          <w:lang w:eastAsia="es-MX"/>
+          <w14:ligatures w14:val="none"/>
+        </w:rPr>
+        <w:t>y</w:t>
+      </w:r>
+      <w:proofErr w:type="gramEnd"/>
+      <w:r>
+        <w:rPr>
+          <w:rFonts w:ascii="Times New Roman" w:eastAsia="Times New Roman" w:hAnsi="Times New Roman" w:cs="Times New Roman"/>
+          <w:color w:val="000000" w:themeColor="text1"/>
+          <w:kern w:val="0"/>
+          <w:lang w:eastAsia="es-MX"/>
+          <w14:ligatures w14:val="none"/>
+        </w:rPr>
+        <w:t xml:space="preserve"> además:</w:t>
       </w:r>
     </w:p>
     <w:p>
@@ -1886,7 +2396,7 @@
           <w:lang w:eastAsia="es-MX"/>
         </w:rPr>
         <w:pict w14:anchorId="74D7F798">
-          <v:rect id="_x0000_i1026" alt="" style="width:441.9pt;height:.05pt;mso-width-percent:0;mso-height-percent:0;mso-width-percent:0;mso-height-percent:0" o:hralign="center" o:hrstd="t" o:hr="t" fillcolor="#a0a0a0" stroked="f"/>
+          <v:rect id="_x0000_i1031" alt="" style="width:441.9pt;height:.05pt;mso-width-percent:0;mso-height-percent:0;mso-width-percent:0;mso-height-percent:0" o:hralign="center" o:hrstd="t" o:hr="t" fillcolor="#a0a0a0" stroked="f"/>
         </w:pict>
       </w:r>
     </w:p>
@@ -2145,7 +2655,7 @@
           <w:lang w:eastAsia="es-MX"/>
         </w:rPr>
         <w:pict w14:anchorId="331D6456">
-          <v:rect id="_x0000_i1025" alt="" style="width:441.9pt;height:.05pt;mso-width-percent:0;mso-height-percent:0;mso-width-percent:0;mso-height-percent:0" o:hralign="center" o:hrstd="t" o:hr="t" fillcolor="#a0a0a0" stroked="f"/>
+          <v:rect id="_x0000_i1032" alt="" style="width:441.9pt;height:.05pt;mso-width-percent:0;mso-height-percent:0;mso-width-percent:0;mso-height-percent:0" o:hralign="center" o:hrstd="t" o:hr="t" fillcolor="#a0a0a0" stroked="f"/>
         </w:pict>
       </w:r>
     </w:p>
@@ -2246,7 +2756,51 @@
           <w:lang w:eastAsia="es-MX"/>
           <w14:ligatures w14:val="none"/>
         </w:rPr>
-        <w:t> el token es válido pero el usuario no tiene el rol necesario para esa acción. Por ejemplo un usuario normal tratando de acceder a un endpoint de administrador.</w:t>
+        <w:t xml:space="preserve"> el token es válido pero el usuario no tiene el rol necesario para esa acción. Por </w:t>
+      </w:r>
+      <w:proofErr w:type="gramStart"/>
+      <w:r>
+        <w:rPr>
+          <w:rFonts w:ascii="Times New Roman" w:eastAsia="Times New Roman" w:hAnsi="Times New Roman" w:cs="Times New Roman"/>
+          <w:color w:val="000000" w:themeColor="text1"/>
+          <w:kern w:val="0"/>
+          <w:lang w:eastAsia="es-MX"/>
+          <w14:ligatures w14:val="none"/>
+        </w:rPr>
+        <w:t>ejemplo</w:t>
+      </w:r>
+      <w:proofErr w:type="gramEnd"/>
+      <w:r>
+        <w:rPr>
+          <w:rFonts w:ascii="Times New Roman" w:eastAsia="Times New Roman" w:hAnsi="Times New Roman" w:cs="Times New Roman"/>
+          <w:color w:val="000000" w:themeColor="text1"/>
+          <w:kern w:val="0"/>
+          <w:lang w:eastAsia="es-MX"/>
+          <w14:ligatures w14:val="none"/>
+        </w:rPr>
+        <w:t xml:space="preserve"> un usuario normal tratando de acceder a un </w:t>
+      </w:r>
+      <w:proofErr w:type="spellStart"/>
+      <w:r>
+        <w:rPr>
+          <w:rFonts w:ascii="Times New Roman" w:eastAsia="Times New Roman" w:hAnsi="Times New Roman" w:cs="Times New Roman"/>
+          <w:color w:val="000000" w:themeColor="text1"/>
+          <w:kern w:val="0"/>
+          <w:lang w:eastAsia="es-MX"/>
+          <w14:ligatures w14:val="none"/>
+        </w:rPr>
+        <w:t>endpoint</w:t>
+      </w:r>
+      <w:proofErr w:type="spellEnd"/>
+      <w:r>
+        <w:rPr>
+          <w:rFonts w:ascii="Times New Roman" w:eastAsia="Times New Roman" w:hAnsi="Times New Roman" w:cs="Times New Roman"/>
+          <w:color w:val="000000" w:themeColor="text1"/>
+          <w:kern w:val="0"/>
+          <w:lang w:eastAsia="es-MX"/>
+          <w14:ligatures w14:val="none"/>
+        </w:rPr>
+        <w:t xml:space="preserve"> de administrador.</w:t>
       </w:r>
     </w:p>
     <w:p>
@@ -2382,7 +2936,53 @@
           <w:lang w:eastAsia="es-MX"/>
           <w14:ligatures w14:val="none"/>
         </w:rPr>
-        <w:t> verificar que AUTH_SERVICE_URL en el .env tenga el valor correcto </w:t>
+        <w:t xml:space="preserve"> verificar que AUTH_SERVICE_URL en </w:t>
+      </w:r>
+      <w:proofErr w:type="spellStart"/>
+      <w:proofErr w:type="gramStart"/>
+      <w:r>
+        <w:rPr>
+          <w:rFonts w:ascii="Times New Roman" w:eastAsia="Times New Roman" w:hAnsi="Times New Roman" w:cs="Times New Roman"/>
+          <w:color w:val="000000" w:themeColor="text1"/>
+          <w:kern w:val="0"/>
+          <w:lang w:eastAsia="es-MX"/>
+          <w14:ligatures w14:val="none"/>
+        </w:rPr>
+        <w:t>el</w:t>
+      </w:r>
+      <w:proofErr w:type="spellEnd"/>
+      <w:r>
+        <w:rPr>
+          <w:rFonts w:ascii="Times New Roman" w:eastAsia="Times New Roman" w:hAnsi="Times New Roman" w:cs="Times New Roman"/>
+          <w:color w:val="000000" w:themeColor="text1"/>
+          <w:kern w:val="0"/>
+          <w:lang w:eastAsia="es-MX"/>
+          <w14:ligatures w14:val="none"/>
+        </w:rPr>
+        <w:t xml:space="preserve"> .</w:t>
+      </w:r>
+      <w:proofErr w:type="spellStart"/>
+      <w:r>
+        <w:rPr>
+          <w:rFonts w:ascii="Times New Roman" w:eastAsia="Times New Roman" w:hAnsi="Times New Roman" w:cs="Times New Roman"/>
+          <w:color w:val="000000" w:themeColor="text1"/>
+          <w:kern w:val="0"/>
+          <w:lang w:eastAsia="es-MX"/>
+          <w14:ligatures w14:val="none"/>
+        </w:rPr>
+        <w:t>env</w:t>
+      </w:r>
+      <w:proofErr w:type="spellEnd"/>
+      <w:proofErr w:type="gramEnd"/>
+      <w:r>
+        <w:rPr>
+          <w:rFonts w:ascii="Times New Roman" w:eastAsia="Times New Roman" w:hAnsi="Times New Roman" w:cs="Times New Roman"/>
+          <w:color w:val="000000" w:themeColor="text1"/>
+          <w:kern w:val="0"/>
+          <w:lang w:eastAsia="es-MX"/>
+          <w14:ligatures w14:val="none"/>
+        </w:rPr>
+        <w:t xml:space="preserve"> tenga el valor correcto </w:t>
       </w:r>
       <w:hyperlink r:id="rId18" w:history="1">
         <w:r>
@@ -2426,7 +3026,7 @@
 </file>
 
 <file path=word/numbering.xml><?xml version="1.0" encoding="utf-8"?>
-<w:numbering xmlns:wpc="http://schemas.microsoft.com/office/word/2010/wordprocessingCanvas" xmlns:cx="http://schemas.microsoft.com/office/drawing/2014/chartex" xmlns:cx1="http://schemas.microsoft.com/office/drawing/2015/9/8/chartex" xmlns:cx2="http://schemas.microsoft.com/office/drawing/2015/10/21/chartex" xmlns:cx3="http://schemas.microsoft.com/office/drawing/2016/5/9/chartex" xmlns:cx4="http://schemas.microsoft.com/office/drawing/2016/5/10/chartex" xmlns:cx5="http://schemas.microsoft.com/office/drawing/2016/5/11/chartex" xmlns:cx6="http://schemas.microsoft.com/office/drawing/2016/5/12/chartex" xmlns:cx7="http://schemas.microsoft.com/office/drawing/2016/5/13/chartex" xmlns:cx8="http://schemas.microsoft.com/office/drawing/2016/5/14/chartex" xmlns:mc="http://schemas.openxmlformats.org/markup-compatibility/2006" xmlns:aink="http://schemas.microsoft.com/office/drawing/2016/ink" xmlns:am3d="http://schemas.microsoft.com/office/drawing/2017/model3d" xmlns:o="urn:schemas-microsoft-com:office:office" xmlns:oel="http://schemas.microsoft.com/office/2019/extlst" xmlns:r="http://schemas.openxmlformats.org/officeDocument/2006/relationships" xmlns:m="http://schemas.openxmlformats.org/officeDocument/2006/math" xmlns:v="urn:schemas-microsoft-com:vml" xmlns:wp14="http://schemas.microsoft.com/office/word/2010/wordprocessingDrawing" xmlns:wp="http://schemas.openxmlformats.org/drawingml/2006/wordprocessingDrawing" xmlns:w10="urn:schemas-microsoft-com:office:word" xmlns:w="http://schemas.openxmlformats.org/wordprocessingml/2006/main" xmlns:w14="http://schemas.microsoft.com/office/word/2010/wordml" xmlns:w15="http://schemas.microsoft.com/office/word/2012/wordml" xmlns:w16cex="http://schemas.microsoft.com/office/word/2018/wordml/cex" xmlns:w16cid="http://schemas.microsoft.com/office/word/2016/wordml/cid" xmlns:w16="http://schemas.microsoft.com/office/word/2018/wordml" xmlns:w16du="http://schemas.microsoft.com/office/word/2023/wordml/word16du" xmlns:w16sdtdh="http://schemas.microsoft.com/office/word/2020/wordml/sdtdatahash" xmlns:w16sdtfl="http://schemas.microsoft.com/office/word/2024/wordml/sdtformatlock" xmlns:w16se="http://schemas.microsoft.com/office/word/2015/wordml/symex" xmlns:wpg="http://schemas.microsoft.com/office/word/2010/wordprocessingGroup" xmlns:wpi="http://schemas.microsoft.com/office/word/2010/wordprocessingInk" xmlns:wne="http://schemas.microsoft.com/office/word/2006/wordml" xmlns:wps="http://schemas.microsoft.com/office/word/2010/wordprocessingShape" mc:Ignorable="w14 w15 w16se w16cid w16 w16cex w16sdtdh w16sdtfl w16du wp14">
+<w:numbering xmlns:wpc="http://schemas.microsoft.com/office/word/2010/wordprocessingCanvas" xmlns:cx="http://schemas.microsoft.com/office/drawing/2014/chartex" xmlns:cx1="http://schemas.microsoft.com/office/drawing/2015/9/8/chartex" xmlns:cx2="http://schemas.microsoft.com/office/drawing/2015/10/21/chartex" xmlns:cx3="http://schemas.microsoft.com/office/drawing/2016/5/9/chartex" xmlns:cx4="http://schemas.microsoft.com/office/drawing/2016/5/10/chartex" xmlns:cx5="http://schemas.microsoft.com/office/drawing/2016/5/11/chartex" xmlns:cx6="http://schemas.microsoft.com/office/drawing/2016/5/12/chartex" xmlns:cx7="http://schemas.microsoft.com/office/drawing/2016/5/13/chartex" xmlns:cx8="http://schemas.microsoft.com/office/drawing/2016/5/14/chartex" xmlns:mc="http://schemas.openxmlformats.org/markup-compatibility/2006" xmlns:aink="http://schemas.microsoft.com/office/drawing/2016/ink" xmlns:am3d="http://schemas.microsoft.com/office/drawing/2017/model3d" xmlns:o="urn:schemas-microsoft-com:office:office" xmlns:oel="http://schemas.microsoft.com/office/2019/extlst" xmlns:r="http://schemas.openxmlformats.org/officeDocument/2006/relationships" xmlns:m="http://schemas.openxmlformats.org/officeDocument/2006/math" xmlns:v="urn:schemas-microsoft-com:vml" xmlns:wp14="http://schemas.microsoft.com/office/word/2010/wordprocessingDrawing" xmlns:wp="http://schemas.openxmlformats.org/drawingml/2006/wordprocessingDrawing" xmlns:w10="urn:schemas-microsoft-com:office:word" xmlns:w="http://schemas.openxmlformats.org/wordprocessingml/2006/main" xmlns:w14="http://schemas.microsoft.com/office/word/2010/wordml" xmlns:w15="http://schemas.microsoft.com/office/word/2012/wordml" xmlns:w16cex="http://schemas.microsoft.com/office/word/2018/wordml/cex" xmlns:w16cid="http://schemas.microsoft.com/office/word/2016/wordml/cid" xmlns:w16="http://schemas.microsoft.com/office/word/2018/wordml" xmlns:w16du="http://schemas.microsoft.com/office/word/2023/wordml/word16du" xmlns:w16sdtdh="http://schemas.microsoft.com/office/word/2020/wordml/sdtdatahash" xmlns:w16se="http://schemas.microsoft.com/office/word/2015/wordml/symex" xmlns:wpg="http://schemas.microsoft.com/office/word/2010/wordprocessingGroup" xmlns:wpi="http://schemas.microsoft.com/office/word/2010/wordprocessingInk" xmlns:wne="http://schemas.microsoft.com/office/word/2006/wordml" xmlns:wps="http://schemas.microsoft.com/office/word/2010/wordprocessingShape" mc:Ignorable="w14 w15 w16se w16cid w16 w16cex w16sdtdh w16du wp14">
   <w:abstractNum w:abstractNumId="0" w15:restartNumberingAfterBreak="0">
     <w:nsid w:val="36604529"/>
     <w:multiLevelType w:val="multilevel"/>
@@ -2735,7 +3335,7 @@
 </file>
 
 <file path=word/styles.xml><?xml version="1.0" encoding="utf-8"?>
-<w:styles xmlns:mc="http://schemas.openxmlformats.org/markup-compatibility/2006" xmlns:r="http://schemas.openxmlformats.org/officeDocument/2006/relationships" xmlns:w="http://schemas.openxmlformats.org/wordprocessingml/2006/main" xmlns:w14="http://schemas.microsoft.com/office/word/2010/wordml" xmlns:w15="http://schemas.microsoft.com/office/word/2012/wordml" xmlns:w16cex="http://schemas.microsoft.com/office/word/2018/wordml/cex" xmlns:w16cid="http://schemas.microsoft.com/office/word/2016/wordml/cid" xmlns:w16="http://schemas.microsoft.com/office/word/2018/wordml" xmlns:w16du="http://schemas.microsoft.com/office/word/2023/wordml/word16du" xmlns:w16sdtdh="http://schemas.microsoft.com/office/word/2020/wordml/sdtdatahash" xmlns:w16sdtfl="http://schemas.microsoft.com/office/word/2024/wordml/sdtformatlock" xmlns:w16se="http://schemas.microsoft.com/office/word/2015/wordml/symex" mc:Ignorable="w14 w15 w16se w16cid w16 w16cex w16sdtdh w16sdtfl w16du">
+<w:styles xmlns:mc="http://schemas.openxmlformats.org/markup-compatibility/2006" xmlns:r="http://schemas.openxmlformats.org/officeDocument/2006/relationships" xmlns:w="http://schemas.openxmlformats.org/wordprocessingml/2006/main" xmlns:w14="http://schemas.microsoft.com/office/word/2010/wordml" xmlns:w15="http://schemas.microsoft.com/office/word/2012/wordml" xmlns:w16cex="http://schemas.microsoft.com/office/word/2018/wordml/cex" xmlns:w16cid="http://schemas.microsoft.com/office/word/2016/wordml/cid" xmlns:w16="http://schemas.microsoft.com/office/word/2018/wordml" xmlns:w16du="http://schemas.microsoft.com/office/word/2023/wordml/word16du" xmlns:w16sdtdh="http://schemas.microsoft.com/office/word/2020/wordml/sdtdatahash" xmlns:w16se="http://schemas.microsoft.com/office/word/2015/wordml/symex" mc:Ignorable="w14 w15 w16se w16cid w16 w16cex w16sdtdh w16du">
   <w:docDefaults>
     <w:rPrDefault>
       <w:rPr>
@@ -3663,7 +4263,7 @@
       <w14:ligatures w14:val="none"/>
     </w:rPr>
   </w:style>
-  <w:style w:type="character" w:styleId="Fuerte">
+  <w:style w:type="character" w:styleId="Textoennegrita">
     <w:name w:val="Strong"/>
     <w:basedOn w:val="Fuentedeprrafopredeter"/>
     <w:uiPriority w:val="22"/>

</xml_diff>